<commit_message>
docs(informe): URL definitiva de la consola y seccion de publicacion
- Accesos apuntan a http://roho-chatbot.gruporoda.com/console/.
- Nueva seccion 'Publicacion y acceso' que explica el proxy por Apache en el
  puerto 80 y deja anotado el pendiente de HTTPS.
- Regenerado Word y PDF.
</commit_message>
<xml_diff>
--- a/docs/Informe-Arquitectura-Bot-ROHO.docx
+++ b/docs/Informe-Arquitectura-Bot-ROHO.docx
@@ -4022,7 +4022,80 @@
         <w:pStyle w:val="Heading2"/>
       </w:pPr>
       <w:r>
-        <w:t>Accesos</w:t>
+        <w:t>Publicación y acceso</w:t>
+      </w:r>
+    </w:p>
+    <w:p>
+      <w:pPr>
+        <w:spacing w:after="120"/>
+      </w:pPr>
+      <w:r>
+        <w:rPr>
+          <w:b w:val="0"/>
+          <w:color w:val="4B5563"/>
+          <w:sz w:val="21"/>
+        </w:rPr>
+        <w:t>La consola se publica a través del servidor web de la empresa (Apache) con su propio nombre interno, sobre el puerto 80. No fue necesario abrir puertos nuevos en la red: se aprovecha el acceso que ya existe para los demás sistemas internos. El bot sigue escuchando en el servidor y el servidor web actúa como intermediario.</w:t>
+      </w:r>
+    </w:p>
+    <w:p>
+      <w:pPr>
+        <w:pStyle w:val="ListBullet"/>
+        <w:spacing w:after="60"/>
+      </w:pPr>
+      <w:r>
+        <w:rPr>
+          <w:color w:val="111111"/>
+          <w:sz w:val="21"/>
+        </w:rPr>
+        <w:t>Consola del bot: http://roho-chatbot.gruporoda.com/console/ (operativo).</w:t>
+      </w:r>
+    </w:p>
+    <w:p>
+      <w:pPr>
+        <w:pStyle w:val="ListBullet"/>
+        <w:spacing w:after="60"/>
+      </w:pPr>
+      <w:r>
+        <w:rPr>
+          <w:color w:val="111111"/>
+          <w:sz w:val="21"/>
+        </w:rPr>
+        <w:t>Estado del servicio: http://roho-chatbot.gruporoda.com/health (operativo).</w:t>
+      </w:r>
+    </w:p>
+    <w:p>
+      <w:pPr>
+        <w:pStyle w:val="ListBullet"/>
+        <w:spacing w:after="60"/>
+      </w:pPr>
+      <w:r>
+        <w:rPr>
+          <w:color w:val="111111"/>
+          <w:sz w:val="21"/>
+        </w:rPr>
+        <w:t>Soporte existente: http://soporte.gruporoda.com/ (sin cambios).</w:t>
+      </w:r>
+    </w:p>
+    <w:p>
+      <w:pPr>
+        <w:spacing w:after="120"/>
+      </w:pPr>
+      <w:r>
+        <w:rPr>
+          <w:b w:val="0"/>
+          <w:color w:val="4B5563"/>
+          <w:sz w:val="21"/>
+        </w:rPr>
+        <w:t>Pendiente: certificado HTTPS propio para el subdominio. Hoy el acceso interno va por HTTP dentro de la red corporativa.</w:t>
+      </w:r>
+    </w:p>
+    <w:p>
+      <w:pPr>
+        <w:pStyle w:val="Heading2"/>
+      </w:pPr>
+      <w:r>
+        <w:t>Cómo ingresa cada rol</w:t>
       </w:r>
     </w:p>
     <w:tbl>
@@ -4050,7 +4123,7 @@
                 <w:color w:val="FFFFFF"/>
                 <w:sz w:val="19"/>
               </w:rPr>
-              <w:t>Qué</w:t>
+              <w:t>Rol</w:t>
             </w:r>
           </w:p>
         </w:tc>
@@ -4067,7 +4140,7 @@
                 <w:color w:val="FFFFFF"/>
                 <w:sz w:val="19"/>
               </w:rPr>
-              <w:t>Dónde</w:t>
+              <w:t>Ingreso</w:t>
             </w:r>
           </w:p>
         </w:tc>
@@ -4084,7 +4157,7 @@
                 <w:color w:val="111111"/>
                 <w:sz w:val="19"/>
               </w:rPr>
-              <w:t>Panel de atención y administración</w:t>
+              <w:t>Asesor de atención</w:t>
             </w:r>
           </w:p>
         </w:tc>
@@ -4099,7 +4172,7 @@
                 <w:color w:val="111111"/>
                 <w:sz w:val="19"/>
               </w:rPr>
-              <w:t>http://10.0.8.16:8010/console/ (red interna)</w:t>
+              <w:t>Misma dirección, pestaña “Consola” con su usuario</w:t>
             </w:r>
           </w:p>
         </w:tc>
@@ -4117,7 +4190,7 @@
                 <w:color w:val="111111"/>
                 <w:sz w:val="19"/>
               </w:rPr>
-              <w:t>Panel de encargados de área</w:t>
+              <w:t>Encargado de área</w:t>
             </w:r>
           </w:p>
         </w:tc>
@@ -4133,7 +4206,7 @@
                 <w:color w:val="111111"/>
                 <w:sz w:val="19"/>
               </w:rPr>
-              <w:t>Misma dirección, pestaña “Área” en el ingreso</w:t>
+              <w:t>Misma dirección, pestaña “Área” con su usuario</w:t>
             </w:r>
           </w:p>
         </w:tc>
@@ -4150,7 +4223,7 @@
                 <w:color w:val="111111"/>
                 <w:sz w:val="19"/>
               </w:rPr>
-              <w:t>Estado del servicio</w:t>
+              <w:t>Administrador</w:t>
             </w:r>
           </w:p>
         </w:tc>
@@ -4165,7 +4238,7 @@
                 <w:color w:val="111111"/>
                 <w:sz w:val="19"/>
               </w:rPr>
-              <w:t>http://10.0.8.16:8010/health</w:t>
+              <w:t>Misma dirección, acceso completo</w:t>
             </w:r>
           </w:p>
         </w:tc>

</xml_diff>